<commit_message>
Cover: add video link and Jay's email
Co-authored-by: Cursor <cursoragent@cursor.com>
</commit_message>
<xml_diff>
--- a/file/1_Cover_and_Agreement/SWEN303_Group4_Cover.docx
+++ b/file/1_Cover_and_Agreement/SWEN303_Group4_Cover.docx
@@ -43,7 +43,15 @@
         </w:rPr>
         <w:t xml:space="preserve">Video link: </w:t>
       </w:r>
-      <w:r/>
+      <w:hyperlink r:id="rId10">
+        <w:r>
+          <w:rPr>
+            <w:color w:val="1155CC"/>
+            <w:u w:val="single"/>
+          </w:rPr>
+          <w:t>https://youtu.be/SfNXymfYKVg</w:t>
+        </w:r>
+      </w:hyperlink>
     </w:p>
     <w:p>
       <w:pPr>
@@ -306,7 +314,7 @@
                 <w:color w:val="202020"/>
                 <w:sz w:val="20"/>
               </w:rPr>
-              <w:t>(to be confirmed)</w:t>
+              <w:t>caversjaco@myvuw.ac.nz</w:t>
             </w:r>
           </w:p>
         </w:tc>

</xml_diff>